<commit_message>
Peer review sheet: group, standards line, plain After checks
- "a group member's" plan (Week 10 reviews in threes), not a partner's.
- A "Their standards" line under the research question.
- Item 4 asks whether the After is on the same math as the standards and
  collects work from the focus students.
- Week 9 deck and day 2 outline: the same two checks, said plainly
  ("drifted next door", "end up in your hands" are gone).

Co-Authored-By: Claude Opus 5.5 <noreply@anthropic.com>
</commit_message>
<xml_diff>
--- a/week-10-investigation-plan/week-10-peer-review-sheet.docx
+++ b/week-10-investigation-plan/week-10-peer-review-sheet.docx
@@ -24,7 +24,7 @@
         <w:rPr>
           <w:b w:val="0"/>
         </w:rPr>
-        <w:t>Read your partner's whole Investigation Plan against their research question, then talk it through. Spend the most time on the After. Be concrete — point to where.</w:t>
+        <w:t>Read a group member's whole Investigation Plan against their research question, then talk it through. Spend the most time on the After. Be concrete — point to where.</w:t>
       </w:r>
     </w:p>
     <w:p>
@@ -41,6 +41,14 @@
           <w:b w:val="0"/>
         </w:rPr>
         <w:t>Their research question: ________________________________________________________</w:t>
+      </w:r>
+    </w:p>
+    <w:p>
+      <w:r>
+        <w:rPr>
+          <w:b w:val="0"/>
+        </w:rPr>
+        <w:t>Their standards: ______________________________________________________________</w:t>
       </w:r>
     </w:p>
     <w:p>
@@ -133,7 +141,7 @@
         <w:t xml:space="preserve">4. An After that captures thinking.  (Spend the most time here.) </w:t>
       </w:r>
       <w:r>
-        <w:t>Would what the After collects be evidence you could actually study against the question — or is it too thin? Does their Assessment section say what they will look for in it?</w:t>
+        <w:t>Would what the After collects be evidence you could actually study against the question — or is it too thin? Does their Assessment section say what they will look for in it? Does the After ask about the same math as their standards? Will the After collect work from their focus students?</w:t>
       </w:r>
     </w:p>
     <w:p>

</xml_diff>

<commit_message>
Week 10 peer review: comments go in the author's Google Doc; sheet is one page
The peer-review sheet drops the fill-in lines and the writing space and
tells reviewers to comment in the author's Google Doc. It now fits on one
page. Day 1 links it as the guide for comments, and both days stop
referring to paper sheets.

Co-Authored-By: Claude Opus 5.5 <noreply@anthropic.com>
</commit_message>
<xml_diff>
--- a/week-10-investigation-plan/week-10-peer-review-sheet.docx
+++ b/week-10-investigation-plan/week-10-peer-review-sheet.docx
@@ -24,31 +24,7 @@
         <w:rPr>
           <w:b w:val="0"/>
         </w:rPr>
-        <w:t>Read a group member's whole Investigation Plan against their research question, then talk it through. Spend the most time on the After. Be concrete — point to where.</w:t>
-      </w:r>
-    </w:p>
-    <w:p>
-      <w:r>
-        <w:rPr>
-          <w:b w:val="0"/>
-        </w:rPr>
-        <w:t>Plan author (pseudonym): ____________________    Reviewer: ____________________</w:t>
-      </w:r>
-    </w:p>
-    <w:p>
-      <w:r>
-        <w:rPr>
-          <w:b w:val="0"/>
-        </w:rPr>
-        <w:t>Their research question: ________________________________________________________</w:t>
-      </w:r>
-    </w:p>
-    <w:p>
-      <w:r>
-        <w:rPr>
-          <w:b w:val="0"/>
-        </w:rPr>
-        <w:t>Their standards: ______________________________________________________________</w:t>
+        <w:t>Read a group member's whole Investigation Plan against their research question. Put your comments in their Google Doc, on the lines they are about. Leave at least one comment for each question below. Spend the most time on the After. Be concrete: point to where.</w:t>
       </w:r>
     </w:p>
     <w:p>
@@ -59,6 +35,9 @@
       </w:r>
     </w:p>
     <w:p>
+      <w:pPr>
+        <w:spacing w:after="200"/>
+      </w:pPr>
       <w:r>
         <w:rPr>
           <w:b/>
@@ -70,20 +49,9 @@
       </w:r>
     </w:p>
     <w:p>
-      <w:r>
-        <w:rPr>
-          <w:b w:val="0"/>
-        </w:rPr>
-      </w:r>
-    </w:p>
-    <w:p>
-      <w:r>
-        <w:rPr>
-          <w:b w:val="0"/>
-        </w:rPr>
-      </w:r>
-    </w:p>
-    <w:p>
+      <w:pPr>
+        <w:spacing w:after="200"/>
+      </w:pPr>
       <w:r>
         <w:rPr>
           <w:b/>
@@ -95,20 +63,9 @@
       </w:r>
     </w:p>
     <w:p>
-      <w:r>
-        <w:rPr>
-          <w:b w:val="0"/>
-        </w:rPr>
-      </w:r>
-    </w:p>
-    <w:p>
-      <w:r>
-        <w:rPr>
-          <w:b w:val="0"/>
-        </w:rPr>
-      </w:r>
-    </w:p>
-    <w:p>
+      <w:pPr>
+        <w:spacing w:after="200"/>
+      </w:pPr>
       <w:r>
         <w:rPr>
           <w:b/>
@@ -120,20 +77,9 @@
       </w:r>
     </w:p>
     <w:p>
-      <w:r>
-        <w:rPr>
-          <w:b w:val="0"/>
-        </w:rPr>
-      </w:r>
-    </w:p>
-    <w:p>
-      <w:r>
-        <w:rPr>
-          <w:b w:val="0"/>
-        </w:rPr>
-      </w:r>
-    </w:p>
-    <w:p>
+      <w:pPr>
+        <w:spacing w:after="200"/>
+      </w:pPr>
       <w:r>
         <w:rPr>
           <w:b/>
@@ -145,20 +91,9 @@
       </w:r>
     </w:p>
     <w:p>
-      <w:r>
-        <w:rPr>
-          <w:b w:val="0"/>
-        </w:rPr>
-      </w:r>
-    </w:p>
-    <w:p>
-      <w:r>
-        <w:rPr>
-          <w:b w:val="0"/>
-        </w:rPr>
-      </w:r>
-    </w:p>
-    <w:p>
+      <w:pPr>
+        <w:spacing w:after="200"/>
+      </w:pPr>
       <w:r>
         <w:rPr>
           <w:b/>
@@ -166,21 +101,7 @@
         <w:t xml:space="preserve">5. One or two changes. </w:t>
       </w:r>
       <w:r>
-        <w:t>The most useful change to make this a sharper instrument for their question:</w:t>
-      </w:r>
-    </w:p>
-    <w:p>
-      <w:r>
-        <w:rPr>
-          <w:b w:val="0"/>
-        </w:rPr>
-      </w:r>
-    </w:p>
-    <w:p>
-      <w:r>
-        <w:rPr>
-          <w:b w:val="0"/>
-        </w:rPr>
+        <w:t>The most useful change to make this a sharper instrument for their question. Leave this as a comment at the top of their Doc.</w:t>
       </w:r>
     </w:p>
     <w:sectPr>

</xml_diff>